<commit_message>
backup: 20260816_195613 full backup
</commit_message>
<xml_diff>
--- a/智能风险研判（农村自建房）风险清单20260816.docx
+++ b/智能风险研判（农村自建房）风险清单20260816.docx
@@ -508,6 +508,93 @@
             </w:pPr>
             <w:r>
               <w:rPr>
+                <w:color w:val="0070C0"/>
+                <w:sz w:val="18"/>
+              </w:rPr>
+              <w:t>下拉选择框＋自定义输入</w:t>
+            </w:r>
+          </w:p>
+        </w:tc>
+        <w:tc>
+          <w:tcPr>
+            <w:tcW w:w="1193" w:type="dxa"/>
+          </w:tcPr>
+          <w:p>
+            <w:pPr>
+              <w:spacing w:after="0" w:line="240" w:lineRule="auto"/>
+            </w:pPr>
+            <w:r>
+              <w:rPr>
+                <w:sz w:val="18"/>
+              </w:rPr>
+              <w:t>是</w:t>
+            </w:r>
+          </w:p>
+        </w:tc>
+        <w:tc>
+          <w:tcPr>
+            <w:tcW w:w="4590" w:type="dxa"/>
+          </w:tcPr>
+          <w:p>
+            <w:pPr>
+              <w:spacing w:after="0" w:line="240" w:lineRule="auto"/>
+            </w:pPr>
+            <w:r>
+              <w:rPr>
+                <w:color w:val="0070C0"/>
+                <w:sz w:val="18"/>
+              </w:rPr>
+              <w:t>选项随风险主项联动：建筑结构信息→地基基础、墙体、梁、柱、楼、屋盖、次要构件；建筑基本信息→建成时间、设计方式、改扩建情况；选择"自定义..."后展开输入框手动录入</w:t>
+            </w:r>
+          </w:p>
+        </w:tc>
+      </w:tr>
+      <w:tr>
+        <w:tblPrEx>
+          <w:tblBorders>
+            <w:top w:val="single" w:color="auto" w:sz="4" w:space="0"/>
+            <w:left w:val="single" w:color="auto" w:sz="4" w:space="0"/>
+            <w:bottom w:val="single" w:color="auto" w:sz="4" w:space="0"/>
+            <w:right w:val="single" w:color="auto" w:sz="4" w:space="0"/>
+            <w:insideH w:val="single" w:color="auto" w:sz="4" w:space="0"/>
+            <w:insideV w:val="single" w:color="auto" w:sz="4" w:space="0"/>
+          </w:tblBorders>
+          <w:tblCellMar>
+            <w:top w:w="0" w:type="dxa"/>
+            <w:left w:w="108" w:type="dxa"/>
+            <w:bottom w:w="0" w:type="dxa"/>
+            <w:right w:w="108" w:type="dxa"/>
+          </w:tblCellMar>
+        </w:tblPrEx>
+        <w:trPr>
+          <w:jc w:val="center"/>
+        </w:trPr>
+        <w:tc>
+          <w:tcPr>
+            <w:tcW w:w="1332" w:type="dxa"/>
+          </w:tcPr>
+          <w:p>
+            <w:pPr>
+              <w:spacing w:after="0" w:line="240" w:lineRule="auto"/>
+            </w:pPr>
+            <w:r>
+              <w:rPr>
+                <w:sz w:val="18"/>
+              </w:rPr>
+              <w:t>分项内容</w:t>
+            </w:r>
+          </w:p>
+        </w:tc>
+        <w:tc>
+          <w:tcPr>
+            <w:tcW w:w="1407" w:type="dxa"/>
+          </w:tcPr>
+          <w:p>
+            <w:pPr>
+              <w:spacing w:after="0" w:line="240" w:lineRule="auto"/>
+            </w:pPr>
+            <w:r>
+              <w:rPr>
                 <w:sz w:val="18"/>
               </w:rPr>
               <w:t>单行文本框</w:t>
@@ -540,9 +627,10 @@
             </w:pPr>
             <w:r>
               <w:rPr>
-                <w:sz w:val="18"/>
-              </w:rPr>
-              <w:t>占位提示“如：地基基础、墙体、梁、柱”</w:t>
+                <w:color w:val="0070C0"/>
+                <w:sz w:val="18"/>
+              </w:rPr>
+              <w:t>占位提示“如：地基基础情况、墙体情况”；支持输入1～100个字符</w:t>
             </w:r>
           </w:p>
         </w:tc>
@@ -579,7 +667,7 @@
               <w:rPr>
                 <w:sz w:val="18"/>
               </w:rPr>
-              <w:t>分项内容</w:t>
+              <w:t>风险识别</w:t>
             </w:r>
           </w:p>
         </w:tc>
@@ -593,9 +681,10 @@
             </w:pPr>
             <w:r>
               <w:rPr>
-                <w:sz w:val="18"/>
-              </w:rPr>
-              <w:t>单行文本框</w:t>
+                <w:color w:val="0070C0"/>
+                <w:sz w:val="18"/>
+              </w:rPr>
+              <w:t>富文本编辑器</w:t>
             </w:r>
           </w:p>
         </w:tc>
@@ -625,23 +714,10 @@
             </w:pPr>
             <w:r>
               <w:rPr>
-                <w:sz w:val="18"/>
-              </w:rPr>
-              <w:t>占位提示“如：地基基础情况、墙体情况”；支持输入1～</w:t>
-            </w:r>
-            <w:r>
-              <w:rPr>
-                <w:rFonts w:hint="eastAsia"/>
-                <w:sz w:val="18"/>
-                <w:lang w:val="en-US" w:eastAsia="zh-CN"/>
-              </w:rPr>
-              <w:t>10</w:t>
-            </w:r>
-            <w:r>
-              <w:rPr>
-                <w:sz w:val="18"/>
-              </w:rPr>
-              <w:t>0个字符</w:t>
+                <w:color w:val="0070C0"/>
+                <w:sz w:val="18"/>
+              </w:rPr>
+              <w:t>带工具栏的富文本编辑器：支持加粗、斜体、下划线、删除线、有序/无序列表排版，支持插入图片、文档、视频附件（单个附件最大20MB），底部实时显示已插入附件数量</w:t>
             </w:r>
           </w:p>
         </w:tc>
@@ -678,7 +754,7 @@
               <w:rPr>
                 <w:sz w:val="18"/>
               </w:rPr>
-              <w:t>风险识别</w:t>
+              <w:t>可能导致事故</w:t>
             </w:r>
           </w:p>
         </w:tc>
@@ -692,9 +768,10 @@
             </w:pPr>
             <w:r>
               <w:rPr>
-                <w:sz w:val="18"/>
-              </w:rPr>
-              <w:t>多行文本框</w:t>
+                <w:color w:val="0070C0"/>
+                <w:sz w:val="18"/>
+              </w:rPr>
+              <w:t>标签多选＋自定义添加</w:t>
             </w:r>
           </w:p>
         </w:tc>
@@ -708,6 +785,7 @@
             </w:pPr>
             <w:r>
               <w:rPr>
+                <w:color w:val="0070C0"/>
                 <w:sz w:val="18"/>
               </w:rPr>
               <w:t>是</w:t>
@@ -724,94 +802,10 @@
             </w:pPr>
             <w:r>
               <w:rPr>
-                <w:sz w:val="18"/>
-              </w:rPr>
-              <w:t>占位提示“描述风险识别内容...”；最多输入500个字符</w:t>
-            </w:r>
-          </w:p>
-        </w:tc>
-      </w:tr>
-      <w:tr>
-        <w:tblPrEx>
-          <w:tblBorders>
-            <w:top w:val="single" w:color="auto" w:sz="4" w:space="0"/>
-            <w:left w:val="single" w:color="auto" w:sz="4" w:space="0"/>
-            <w:bottom w:val="single" w:color="auto" w:sz="4" w:space="0"/>
-            <w:right w:val="single" w:color="auto" w:sz="4" w:space="0"/>
-            <w:insideH w:val="single" w:color="auto" w:sz="4" w:space="0"/>
-            <w:insideV w:val="single" w:color="auto" w:sz="4" w:space="0"/>
-          </w:tblBorders>
-          <w:tblCellMar>
-            <w:top w:w="0" w:type="dxa"/>
-            <w:left w:w="108" w:type="dxa"/>
-            <w:bottom w:w="0" w:type="dxa"/>
-            <w:right w:w="108" w:type="dxa"/>
-          </w:tblCellMar>
-        </w:tblPrEx>
-        <w:trPr>
-          <w:jc w:val="center"/>
-        </w:trPr>
-        <w:tc>
-          <w:tcPr>
-            <w:tcW w:w="1332" w:type="dxa"/>
-          </w:tcPr>
-          <w:p>
-            <w:pPr>
-              <w:spacing w:after="0" w:line="240" w:lineRule="auto"/>
-            </w:pPr>
-            <w:r>
-              <w:rPr>
-                <w:sz w:val="18"/>
-              </w:rPr>
-              <w:t>可能导致事故</w:t>
-            </w:r>
-          </w:p>
-        </w:tc>
-        <w:tc>
-          <w:tcPr>
-            <w:tcW w:w="1407" w:type="dxa"/>
-          </w:tcPr>
-          <w:p>
-            <w:pPr>
-              <w:spacing w:after="0" w:line="240" w:lineRule="auto"/>
-            </w:pPr>
-            <w:r>
-              <w:rPr>
-                <w:sz w:val="18"/>
-              </w:rPr>
-              <w:t>单行文本框</w:t>
-            </w:r>
-          </w:p>
-        </w:tc>
-        <w:tc>
-          <w:tcPr>
-            <w:tcW w:w="1193" w:type="dxa"/>
-          </w:tcPr>
-          <w:p>
-            <w:pPr>
-              <w:spacing w:after="0" w:line="240" w:lineRule="auto"/>
-            </w:pPr>
-            <w:r>
-              <w:rPr>
-                <w:sz w:val="18"/>
-              </w:rPr>
-              <w:t>否</w:t>
-            </w:r>
-          </w:p>
-        </w:tc>
-        <w:tc>
-          <w:tcPr>
-            <w:tcW w:w="4590" w:type="dxa"/>
-          </w:tcPr>
-          <w:p>
-            <w:pPr>
-              <w:spacing w:after="0" w:line="240" w:lineRule="auto"/>
-            </w:pPr>
-            <w:r>
-              <w:rPr>
-                <w:sz w:val="18"/>
-              </w:rPr>
-              <w:t>占位提示“如：房屋倾斜或倒塌、墙体酥碎”；最多输入100个字符</w:t>
+                <w:color w:val="0070C0"/>
+                <w:sz w:val="18"/>
+              </w:rPr>
+              <w:t>预设事故标签：坍塌、高处坠落、触电、火灾，点击标签多选；点击"+ 自定义"按钮展开输入框，输入后回车或失焦添加为自定义标签；实时显示"已选N项"</w:t>
             </w:r>
           </w:p>
         </w:tc>
@@ -6007,7 +6001,10 @@
     </w:p>
     <w:p>
       <w:r>
-        <w:t>13. 必填校验规则：风险主项、风险等级、分项、分项内容、风险识别、已关联预防措施为必填项；未填写或仅包含空格时不得保存；选择“条件启用”时启用条件类型和条件值为必填。</w:t>
+        <w:rPr>
+          <w:color w:val="0070C0"/>
+        </w:rPr>
+        <w:t>13. 必填校验规则：基础信息步骤（第1步）的风险主项、风险等级、分项、分项内容、风险识别、可能导致事故均为必填项，标签以红色"*"标识；未填写或仅包含空格时不得保存并提示；已关联预防措施为必填项；选择"条件启用"时启用条件类型和条件值为必填。</w:t>
       </w:r>
     </w:p>
     <w:p>
@@ -6053,12 +6050,18 @@
     </w:p>
     <w:p>
       <w:r>
-        <w:t>4. 新增交互：点击“新增风险”打开新增分步向导弹窗，表单重置，风险主项默认“建筑结构信息”、风险等级默认“一般损坏房（黄）”、监管状态默认“启用”；通过“下一步／上一步”在3个步骤间切换，步骤标签同步高亮；第3步点击“保存”执行必填、长度和重复性校验，校验通过后写入清单并提示“新增成功”；点击“取消”关闭弹窗且不保存。</w:t>
+        <w:rPr>
+          <w:color w:val="0070C0"/>
+        </w:rPr>
+        <w:t>4. 新增交互：点击"新增风险"打开新增分步向导弹窗，表单重置，风险主项默认"建筑结构信息"、分项选项随主项联动、风险等级默认"一般损坏房（黄）"、监管状态默认"启用"；通过"下一步／上一步"在3个步骤间切换，步骤标签同步高亮；弹窗底部不提供"取消"按钮，仅可通过右上角关闭按钮关闭；第3步保存按钮文案为"确认新增"。</w:t>
       </w:r>
     </w:p>
     <w:p>
       <w:r>
-        <w:t>5. 编辑交互：点击“编辑”打开编辑分步向导弹窗并回填全部字段，序号只读；保存后更新数据并提示“保存成功”。保存期间按钮置灰，防止重复提交。</w:t>
+        <w:rPr>
+          <w:color w:val="0070C0"/>
+        </w:rPr>
+        <w:t>5. 编辑交互：点击"编辑"打开编辑分步向导弹窗并回填全部字段，序号只读；分项按原值回填，非预设分项以"自定义"形式回填；可能导致事故按标签选中态回填，非预设事故自动追加为自定义标签；保存后更新数据并提示"保存成功"。保存期间按钮置灰，防止重复提交；弹窗底部不提供"取消"按钮。</w:t>
       </w:r>
     </w:p>
     <w:p>
@@ -7358,6 +7361,34 @@
           </w:p>
         </w:tc>
       </w:tr>
+      <w:tr>
+        <w:tc>
+          <w:tcPr>
+            <w:tcW w:type="dxa" w:w="4259"/>
+          </w:tcPr>
+          <w:p>
+            <w:r>
+              <w:rPr>
+                <w:color w:val="0070C0"/>
+              </w:rPr>
+              <w:t>可能导致事故未选择</w:t>
+            </w:r>
+          </w:p>
+        </w:tc>
+        <w:tc>
+          <w:tcPr>
+            <w:tcW w:type="dxa" w:w="4263"/>
+          </w:tcPr>
+          <w:p>
+            <w:r>
+              <w:rPr>
+                <w:color w:val="0070C0"/>
+              </w:rPr>
+              <w:t>请填写可能导致事故</w:t>
+            </w:r>
+          </w:p>
+        </w:tc>
+      </w:tr>
     </w:tbl>
     <w:p/>
     <w:p>
@@ -8550,9 +8581,10 @@
             </w:pPr>
             <w:r>
               <w:rPr>
-                <w:sz w:val="18"/>
-              </w:rPr>
-              <w:t>点击保存</w:t>
+                <w:color w:val="0070C0"/>
+                <w:sz w:val="18"/>
+              </w:rPr>
+              <w:t>点击"确认新增"</w:t>
             </w:r>
           </w:p>
         </w:tc>
@@ -10643,9 +10675,10 @@
             </w:pPr>
             <w:r>
               <w:rPr>
-                <w:sz w:val="18"/>
-              </w:rPr>
-              <w:t>完成3步向导全部必填项并点击“保存”</w:t>
+                <w:color w:val="0070C0"/>
+                <w:sz w:val="18"/>
+              </w:rPr>
+              <w:t>完成3步向导全部必填项并点击"确认新增"</w:t>
             </w:r>
           </w:p>
         </w:tc>
@@ -10935,9 +10968,10 @@
             </w:pPr>
             <w:r>
               <w:rPr>
-                <w:sz w:val="18"/>
-              </w:rPr>
-              <w:t>不展示“下一步”按钮，展示“保存”按钮</w:t>
+                <w:color w:val="0070C0"/>
+                <w:sz w:val="18"/>
+              </w:rPr>
+              <w:t>不展示"下一步"按钮，展示"确认新增"按钮</w:t>
             </w:r>
           </w:p>
         </w:tc>
@@ -10988,25 +11022,27 @@
             </w:pPr>
             <w:r>
               <w:rPr>
-                <w:sz w:val="18"/>
-              </w:rPr>
-              <w:t>不填写分项，完成其他必填项后点击“保存”</w:t>
-            </w:r>
-          </w:p>
-        </w:tc>
-        <w:tc>
-          <w:tcPr>
-            <w:tcW w:w="2880" w:type="dxa"/>
-          </w:tcPr>
-          <w:p>
-            <w:pPr>
-              <w:spacing w:after="0" w:line="240" w:lineRule="auto"/>
-            </w:pPr>
-            <w:r>
-              <w:rPr>
-                <w:sz w:val="18"/>
-              </w:rPr>
-              <w:t>系统不保存数据，并提示“请输入分项”</w:t>
+                <w:color w:val="0070C0"/>
+                <w:sz w:val="18"/>
+              </w:rPr>
+              <w:t>不填写分项，完成其他必填项后点击"确认新增"</w:t>
+            </w:r>
+          </w:p>
+        </w:tc>
+        <w:tc>
+          <w:tcPr>
+            <w:tcW w:w="2880" w:type="dxa"/>
+          </w:tcPr>
+          <w:p>
+            <w:pPr>
+              <w:spacing w:after="0" w:line="240" w:lineRule="auto"/>
+            </w:pPr>
+            <w:r>
+              <w:rPr>
+                <w:color w:val="0070C0"/>
+                <w:sz w:val="18"/>
+              </w:rPr>
+              <w:t>系统不保存数据，并提示"请填写分项"</w:t>
             </w:r>
           </w:p>
         </w:tc>
@@ -11057,9 +11093,10 @@
             </w:pPr>
             <w:r>
               <w:rPr>
-                <w:sz w:val="18"/>
-              </w:rPr>
-              <w:t>不填写分项内容后点击“保存”</w:t>
+                <w:color w:val="0070C0"/>
+                <w:sz w:val="18"/>
+              </w:rPr>
+              <w:t>不填写分项内容后点击"确认新增"</w:t>
             </w:r>
           </w:p>
         </w:tc>
@@ -11126,9 +11163,10 @@
             </w:pPr>
             <w:r>
               <w:rPr>
-                <w:sz w:val="18"/>
-              </w:rPr>
-              <w:t>不填写风险识别或仅输入空格后点击“保存”</w:t>
+                <w:color w:val="0070C0"/>
+                <w:sz w:val="18"/>
+              </w:rPr>
+              <w:t>不在风险识别富文本编辑器中输入内容后点击"确认新增"</w:t>
             </w:r>
           </w:p>
         </w:tc>
@@ -11585,41 +11623,44 @@
             </w:pPr>
             <w:r>
               <w:rPr>
-                <w:sz w:val="18"/>
-              </w:rPr>
-              <w:t>【正常】取消新增</w:t>
-            </w:r>
-          </w:p>
-        </w:tc>
-        <w:tc>
-          <w:tcPr>
-            <w:tcW w:w="2880" w:type="dxa"/>
-          </w:tcPr>
-          <w:p>
-            <w:pPr>
-              <w:spacing w:after="0" w:line="240" w:lineRule="auto"/>
-            </w:pPr>
-            <w:r>
-              <w:rPr>
-                <w:sz w:val="18"/>
-              </w:rPr>
-              <w:t>填写部分内容后点击“取消”</w:t>
-            </w:r>
-          </w:p>
-        </w:tc>
-        <w:tc>
-          <w:tcPr>
-            <w:tcW w:w="2880" w:type="dxa"/>
-          </w:tcPr>
-          <w:p>
-            <w:pPr>
-              <w:spacing w:after="0" w:line="240" w:lineRule="auto"/>
-            </w:pPr>
-            <w:r>
-              <w:rPr>
-                <w:sz w:val="18"/>
-              </w:rPr>
-              <w:t>弹窗关闭，系统不新增条目，列表和统计数据不变</w:t>
+                <w:color w:val="0070C0"/>
+                <w:sz w:val="18"/>
+              </w:rPr>
+              <w:t>【正常】关闭新增弹窗</w:t>
+            </w:r>
+          </w:p>
+        </w:tc>
+        <w:tc>
+          <w:tcPr>
+            <w:tcW w:w="2880" w:type="dxa"/>
+          </w:tcPr>
+          <w:p>
+            <w:pPr>
+              <w:spacing w:after="0" w:line="240" w:lineRule="auto"/>
+            </w:pPr>
+            <w:r>
+              <w:rPr>
+                <w:color w:val="0070C0"/>
+                <w:sz w:val="18"/>
+              </w:rPr>
+              <w:t>填写部分内容后点击右上角关闭按钮</w:t>
+            </w:r>
+          </w:p>
+        </w:tc>
+        <w:tc>
+          <w:tcPr>
+            <w:tcW w:w="2880" w:type="dxa"/>
+          </w:tcPr>
+          <w:p>
+            <w:pPr>
+              <w:spacing w:after="0" w:line="240" w:lineRule="auto"/>
+            </w:pPr>
+            <w:r>
+              <w:rPr>
+                <w:color w:val="0070C0"/>
+                <w:sz w:val="18"/>
+              </w:rPr>
+              <w:t>弹窗关闭，系统不新增条目，列表和统计数据不变；弹窗底部无"取消"按钮</w:t>
             </w:r>
           </w:p>
         </w:tc>
@@ -11670,9 +11711,10 @@
             </w:pPr>
             <w:r>
               <w:rPr>
-                <w:sz w:val="18"/>
-              </w:rPr>
-              <w:t>填写合法数据后连续快速点击两次“保存”</w:t>
+                <w:color w:val="0070C0"/>
+                <w:sz w:val="18"/>
+              </w:rPr>
+              <w:t>填写合法数据后连续快速点击两次"确认新增"</w:t>
             </w:r>
           </w:p>
         </w:tc>
@@ -11739,9 +11781,10 @@
             </w:pPr>
             <w:r>
               <w:rPr>
-                <w:sz w:val="18"/>
-              </w:rPr>
-              <w:t>模拟新增接口返回失败后点击“保存”</w:t>
+                <w:color w:val="0070C0"/>
+                <w:sz w:val="18"/>
+              </w:rPr>
+              <w:t>模拟新增接口返回失败后点击"确认新增"</w:t>
             </w:r>
           </w:p>
         </w:tc>
@@ -11896,6 +11939,47 @@
                 <w:sz w:val="18"/>
               </w:rPr>
               <w:t>条目监管状态为“条件启用”，启用条件保存为“按季节启用：汛期（6-9月）、台风季”</w:t>
+            </w:r>
+          </w:p>
+        </w:tc>
+      </w:tr>
+      <w:tr>
+        <w:tc>
+          <w:tcPr>
+            <w:tcW w:type="dxa" w:w="2836"/>
+          </w:tcPr>
+          <w:p>
+            <w:r>
+              <w:rPr>
+                <w:color w:val="0070C0"/>
+              </w:rPr>
+              <w:t>【异常】可能导致事故未选择</w:t>
+            </w:r>
+          </w:p>
+        </w:tc>
+        <w:tc>
+          <w:tcPr>
+            <w:tcW w:type="dxa" w:w="2841"/>
+          </w:tcPr>
+          <w:p>
+            <w:r>
+              <w:rPr>
+                <w:color w:val="0070C0"/>
+              </w:rPr>
+              <w:t>不选择任何事故标签，完成其他必填项后点击"确认新增"</w:t>
+            </w:r>
+          </w:p>
+        </w:tc>
+        <w:tc>
+          <w:tcPr>
+            <w:tcW w:type="dxa" w:w="2845"/>
+          </w:tcPr>
+          <w:p>
+            <w:r>
+              <w:rPr>
+                <w:color w:val="0070C0"/>
+              </w:rPr>
+              <w:t>系统不保存数据，并提示"请填写可能导致事故"</w:t>
             </w:r>
           </w:p>
         </w:tc>
@@ -12067,9 +12151,10 @@
             </w:pPr>
             <w:r>
               <w:rPr>
-                <w:sz w:val="18"/>
-              </w:rPr>
-              <w:t>弹窗回填该条目原有主项、等级、分项、分项内容、风险识别、可能导致事故、预防措施、工作依据、备注及监管状态，序号只读</w:t>
+                <w:color w:val="0070C0"/>
+                <w:sz w:val="18"/>
+              </w:rPr>
+              <w:t>弹窗回填该条目原有主项、等级、分项（含自定义分项）、分项内容、风险识别富文本内容、可能导致事故标签选中态、预防措施、工作依据、备注及监管状态，序号只读；底部无"取消"按钮</w:t>
             </w:r>
           </w:p>
         </w:tc>

</xml_diff>